<commit_message>
small changes to the report
</commit_message>
<xml_diff>
--- a/I3335_AI_Report.docx
+++ b/I3335_AI_Report.docx
@@ -222,23 +222,7 @@
           <w:sz w:val="52"/>
           <w:szCs w:val="52"/>
         </w:rPr>
-        <w:t xml:space="preserve">Charbel </w:t>
-      </w:r>
-      <w:proofErr w:type="spellStart"/>
-      <w:r>
-        <w:rPr>
-          <w:sz w:val="52"/>
-          <w:szCs w:val="52"/>
-        </w:rPr>
-        <w:t>Outayek</w:t>
-      </w:r>
-      <w:proofErr w:type="spellEnd"/>
-      <w:r>
-        <w:rPr>
-          <w:sz w:val="52"/>
-          <w:szCs w:val="52"/>
-        </w:rPr>
-        <w:t>- 61222</w:t>
+        <w:t>Charbel Outayek- 61222</w:t>
       </w:r>
     </w:p>
     <w:p>
@@ -2103,14 +2087,7 @@
           <w:sz w:val="32"/>
           <w:szCs w:val="32"/>
         </w:rPr>
-        <w:t xml:space="preserve"> </w:t>
-      </w:r>
-      <w:r>
-        <w:rPr>
-          <w:sz w:val="32"/>
-          <w:szCs w:val="32"/>
-        </w:rPr>
-        <w:t>Where Wordy is</w:t>
+        <w:t xml:space="preserve"> Where Wordy is</w:t>
       </w:r>
       <w:r>
         <w:rPr>
@@ -2542,15 +2519,13 @@
         </w:rPr>
         <w:t xml:space="preserve"> If the algorithm reaches a state where no column is safe and the </w:t>
       </w:r>
-      <w:proofErr w:type="gramStart"/>
-      <w:r>
-        <w:rPr>
-          <w:sz w:val="32"/>
-          <w:szCs w:val="32"/>
-        </w:rPr>
-        <w:t>amount</w:t>
-      </w:r>
-      <w:proofErr w:type="gramEnd"/>
+      <w:r>
+        <w:rPr>
+          <w:sz w:val="32"/>
+          <w:szCs w:val="32"/>
+        </w:rPr>
+        <w:t>number</w:t>
+      </w:r>
       <w:r>
         <w:rPr>
           <w:sz w:val="32"/>
@@ -3016,14 +2991,13 @@
         </w:rPr>
         <w:t xml:space="preserve">, and the 3 minigame puzzles will </w:t>
       </w:r>
-      <w:proofErr w:type="gramStart"/>
       <w:r>
         <w:rPr>
           <w:sz w:val="32"/>
           <w:szCs w:val="32"/>
           <w:lang w:bidi="ar-SA"/>
         </w:rPr>
-        <w:t xml:space="preserve">appear </w:t>
+        <w:t>appear each</w:t>
       </w:r>
       <w:r>
         <w:rPr>
@@ -3031,7 +3005,7 @@
           <w:szCs w:val="32"/>
           <w:lang w:bidi="ar-SA"/>
         </w:rPr>
-        <w:t xml:space="preserve"> </w:t>
+        <w:t xml:space="preserve"> one in a separate part of the main </w:t>
       </w:r>
       <w:r>
         <w:rPr>
@@ -3039,24 +3013,15 @@
           <w:szCs w:val="32"/>
           <w:lang w:bidi="ar-SA"/>
         </w:rPr>
-        <w:t>each</w:t>
-      </w:r>
-      <w:proofErr w:type="gramEnd"/>
+        <w:t>window. (</w:t>
+      </w:r>
       <w:r>
         <w:rPr>
           <w:sz w:val="32"/>
           <w:szCs w:val="32"/>
           <w:lang w:bidi="ar-SA"/>
         </w:rPr>
-        <w:t xml:space="preserve"> one in a separate part of the main window.</w:t>
-      </w:r>
-      <w:r>
-        <w:rPr>
-          <w:sz w:val="32"/>
-          <w:szCs w:val="32"/>
-          <w:lang w:bidi="ar-SA"/>
-        </w:rPr>
-        <w:t>(the user clicks on one of them)</w:t>
+        <w:t>the user clicks on one of them)</w:t>
       </w:r>
     </w:p>
     <w:p>
@@ -3085,13 +3050,41 @@
         </w:rPr>
         <w:t xml:space="preserve">: there is an input under the puzzle picture that asks the user to enter the value of </w:t>
       </w:r>
+      <w:r>
+        <w:rPr>
+          <w:sz w:val="32"/>
+          <w:szCs w:val="32"/>
+        </w:rPr>
+        <w:t>N (</w:t>
+      </w:r>
+      <w:r>
+        <w:rPr>
+          <w:sz w:val="32"/>
+          <w:szCs w:val="32"/>
+        </w:rPr>
+        <w:t>the board size and the Queens number</w:t>
+      </w:r>
       <w:proofErr w:type="gramStart"/>
       <w:r>
         <w:rPr>
           <w:sz w:val="32"/>
           <w:szCs w:val="32"/>
         </w:rPr>
-        <w:t>N(</w:t>
+        <w:t>),</w:t>
+      </w:r>
+      <w:r>
+        <w:rPr>
+          <w:sz w:val="32"/>
+          <w:szCs w:val="32"/>
+        </w:rPr>
+        <w:t xml:space="preserve"> </w:t>
+      </w:r>
+      <w:r>
+        <w:rPr>
+          <w:sz w:val="32"/>
+          <w:szCs w:val="32"/>
+        </w:rPr>
+        <w:t>and</w:t>
       </w:r>
       <w:proofErr w:type="gramEnd"/>
       <w:r>
@@ -3099,30 +3092,7 @@
           <w:sz w:val="32"/>
           <w:szCs w:val="32"/>
         </w:rPr>
-        <w:t>the board size and the Queens number</w:t>
-      </w:r>
-      <w:proofErr w:type="gramStart"/>
-      <w:r>
-        <w:rPr>
-          <w:sz w:val="32"/>
-          <w:szCs w:val="32"/>
-        </w:rPr>
-        <w:t>) ,</w:t>
-      </w:r>
-      <w:proofErr w:type="gramEnd"/>
-      <w:r>
-        <w:rPr>
-          <w:sz w:val="32"/>
-          <w:szCs w:val="32"/>
-        </w:rPr>
-        <w:t xml:space="preserve"> </w:t>
-      </w:r>
-      <w:r>
-        <w:rPr>
-          <w:sz w:val="32"/>
-          <w:szCs w:val="32"/>
-        </w:rPr>
-        <w:t>and will a new window that has a chessboard and will show you every possible solution for the number of queens that you entered.</w:t>
+        <w:t xml:space="preserve"> will a new window that has a chessboard and will show you every possible solution for the number of queens that you entered.</w:t>
       </w:r>
     </w:p>
     <w:p>
@@ -3212,15 +3182,13 @@
         </w:rPr>
         <w:t xml:space="preserve">Knight’s Tour: The user inputs the initial position of the </w:t>
       </w:r>
-      <w:proofErr w:type="gramStart"/>
-      <w:r>
-        <w:rPr>
-          <w:sz w:val="32"/>
-          <w:szCs w:val="32"/>
-        </w:rPr>
-        <w:t>knight</w:t>
-      </w:r>
-      <w:proofErr w:type="gramEnd"/>
+      <w:r>
+        <w:rPr>
+          <w:sz w:val="32"/>
+          <w:szCs w:val="32"/>
+        </w:rPr>
+        <w:t>knight,</w:t>
+      </w:r>
       <w:r>
         <w:rPr>
           <w:sz w:val="32"/>
@@ -5625,6 +5593,7 @@
   <w:style w:type="character" w:default="1" w:styleId="DefaultParagraphFont">
     <w:name w:val="Default Paragraph Font"/>
     <w:uiPriority w:val="1"/>
+    <w:semiHidden/>
     <w:unhideWhenUsed/>
   </w:style>
   <w:style w:type="table" w:default="1" w:styleId="TableNormal">

</xml_diff>